<commit_message>
feat: add initial videography exam format template
</commit_message>
<xml_diff>
--- a/sample/format soal videografi awal_1.docx
+++ b/sample/format soal videografi awal_1.docx
@@ -40,7 +40,7 @@
     </w:p>
     <w:p>
       <w:r>
-        <w:t>Level: Sulit</w:t>
+        <w:t>Level: Mudah</w:t>
       </w:r>
     </w:p>
     <w:p>
@@ -153,7 +153,7 @@
     </w:p>
     <w:p>
       <w:r>
-        <w:t>Level: Sulit</w:t>
+        <w:t>Level: Sedang</w:t>
       </w:r>
     </w:p>
     <w:p>
@@ -266,7 +266,7 @@
     </w:p>
     <w:p>
       <w:r>
-        <w:t>Level: Sulit</w:t>
+        <w:t>Level: Mudah</w:t>
       </w:r>
     </w:p>
     <w:p>
@@ -376,7 +376,7 @@
     </w:p>
     <w:p>
       <w:r>
-        <w:t>Level: Sulit</w:t>
+        <w:t>Level: Sedang</w:t>
       </w:r>
     </w:p>
     <w:p>
@@ -492,7 +492,7 @@
     </w:p>
     <w:p>
       <w:r>
-        <w:t>Level: Sulit</w:t>
+        <w:t>Level: Mudah</w:t>
       </w:r>
     </w:p>
     <w:p>
@@ -602,7 +602,7 @@
     </w:p>
     <w:p>
       <w:r>
-        <w:t>Level: Sulit</w:t>
+        <w:t>Level: Sedang</w:t>
       </w:r>
     </w:p>
     <w:p>
@@ -715,7 +715,7 @@
     </w:p>
     <w:p>
       <w:r>
-        <w:t>Level: Sulit</w:t>
+        <w:t>Level: Mudah</w:t>
       </w:r>
     </w:p>
     <w:p>
@@ -828,10 +828,7 @@
     </w:p>
     <w:p>
       <w:r>
-        <w:t xml:space="preserve">Level: </w:t>
-      </w:r>
-      <w:r>
-        <w:t>Sulit</w:t>
+        <w:t>Level: Mudah</w:t>
       </w:r>
     </w:p>
     <w:p>
@@ -941,7 +938,7 @@
     </w:p>
     <w:p>
       <w:r>
-        <w:t>Level: Sulit</w:t>
+        <w:t>Level: Mudah</w:t>
       </w:r>
     </w:p>
     <w:p>
@@ -1051,7 +1048,7 @@
     </w:p>
     <w:p>
       <w:r>
-        <w:t>Level: Sulit</w:t>
+        <w:t>Level: Sedang</w:t>
       </w:r>
     </w:p>
     <w:p>
@@ -1167,7 +1164,7 @@
     </w:p>
     <w:p>
       <w:r>
-        <w:t>Level: Sulit</w:t>
+        <w:t>Level: Sedang</w:t>
       </w:r>
     </w:p>
     <w:p>
@@ -1280,7 +1277,7 @@
     </w:p>
     <w:p>
       <w:r>
-        <w:t>Level: Sulit</w:t>
+        <w:t>Level: Sedang</w:t>
       </w:r>
     </w:p>
     <w:p>
@@ -1396,7 +1393,7 @@
     </w:p>
     <w:p>
       <w:r>
-        <w:t>Level: Sulit</w:t>
+        <w:t>Level: Mudah</w:t>
       </w:r>
     </w:p>
     <w:p>
@@ -1509,7 +1506,7 @@
     </w:p>
     <w:p>
       <w:r>
-        <w:t>Level: Sulit</w:t>
+        <w:t>Level: Mudah</w:t>
       </w:r>
     </w:p>
     <w:p>
@@ -1622,7 +1619,7 @@
     </w:p>
     <w:p>
       <w:r>
-        <w:t>Level: Sulit</w:t>
+        <w:t>Level: Sedang</w:t>
       </w:r>
     </w:p>
     <w:p>
@@ -1735,7 +1732,7 @@
     </w:p>
     <w:p>
       <w:r>
-        <w:t>Level: Sulit</w:t>
+        <w:t>Level: Sedang</w:t>
       </w:r>
     </w:p>
     <w:p>
@@ -1845,7 +1842,7 @@
     </w:p>
     <w:p>
       <w:r>
-        <w:t>Level: Sulit</w:t>
+        <w:t>Level: Sedang</w:t>
       </w:r>
     </w:p>
     <w:p>
@@ -1961,7 +1958,7 @@
     </w:p>
     <w:p>
       <w:r>
-        <w:t>Level: Sulit</w:t>
+        <w:t>Level: Sedang</w:t>
       </w:r>
     </w:p>
     <w:p>
@@ -2077,7 +2074,7 @@
     </w:p>
     <w:p>
       <w:r>
-        <w:t>Level: Sulit</w:t>
+        <w:t>Level: Sedang</w:t>
       </w:r>
     </w:p>
     <w:p>
@@ -2193,7 +2190,7 @@
     </w:p>
     <w:p>
       <w:r>
-        <w:t>Level: Sulit</w:t>
+        <w:t>Level: Sedang</w:t>
       </w:r>
     </w:p>
     <w:p>
@@ -2306,7 +2303,7 @@
     </w:p>
     <w:p>
       <w:r>
-        <w:t>Level: Sulit</w:t>
+        <w:t>Level: Sedang</w:t>
       </w:r>
     </w:p>
     <w:p>
@@ -2419,7 +2416,7 @@
     </w:p>
     <w:p>
       <w:r>
-        <w:t>Level: Sulit</w:t>
+        <w:t>Level: Sedang</w:t>
       </w:r>
     </w:p>
     <w:p>
@@ -2535,7 +2532,7 @@
     </w:p>
     <w:p>
       <w:r>
-        <w:t>Level: Sulit</w:t>
+        <w:t>Level: Sedang</w:t>
       </w:r>
     </w:p>
     <w:p>
@@ -2648,7 +2645,7 @@
     </w:p>
     <w:p>
       <w:r>
-        <w:t>Level: Sulit</w:t>
+        <w:t>Level: Sedang</w:t>
       </w:r>
     </w:p>
     <w:p>
@@ -2764,7 +2761,7 @@
     </w:p>
     <w:p>
       <w:r>
-        <w:t>Level: Sulit</w:t>
+        <w:t>Level: Sedang</w:t>
       </w:r>
     </w:p>
     <w:p>
@@ -2993,7 +2990,7 @@
     </w:p>
     <w:p>
       <w:r>
-        <w:t>Level: Sulit</w:t>
+        <w:t>Level: Sedang</w:t>
       </w:r>
     </w:p>
     <w:p>
@@ -3109,7 +3106,7 @@
     </w:p>
     <w:p>
       <w:r>
-        <w:t>Level: Sulit</w:t>
+        <w:t>Level: Sedang</w:t>
       </w:r>
     </w:p>
     <w:p>
@@ -3454,7 +3451,7 @@
     </w:p>
     <w:p>
       <w:r>
-        <w:t>Level: Sulit</w:t>
+        <w:t>Level: Sedang</w:t>
       </w:r>
     </w:p>
     <w:p>
@@ -3581,7 +3578,7 @@
     </w:p>
     <w:p>
       <w:r>
-        <w:t>Level: Sulit</w:t>
+        <w:t>Level: Sedang</w:t>
       </w:r>
     </w:p>
     <w:p>
@@ -4189,10 +4186,7 @@
     </w:p>
     <w:p>
       <w:r>
-        <w:t xml:space="preserve">Level: </w:t>
-      </w:r>
-      <w:r>
-        <w:t>Sulit</w:t>
+        <w:t>Level: Sulit</w:t>
       </w:r>
     </w:p>
     <w:p>
@@ -4555,7 +4549,7 @@
     </w:p>
     <w:p>
       <w:r>
-        <w:t>Level: Sulit</w:t>
+        <w:t>Level: Sedang</w:t>
       </w:r>
     </w:p>
     <w:p>

</xml_diff>